<commit_message>
Sostituzione FAQ patente digitale/foto con 3 nuove FAQ su tipologie di patente
</commit_message>
<xml_diff>
--- a/Storico modifiche sito Tuttoscooter.docx
+++ b/Storico modifiche sito Tuttoscooter.docx
@@ -17,7 +17,6 @@
           <w14:ligatures w14:val="none"/>
         </w:rPr>
       </w:pPr>
-      <w:proofErr w:type="gramStart"/>
       <w:r>
         <w:rPr>
           <w:rFonts w:ascii="Times New Roman" w:eastAsia="Times New Roman" w:hAnsi="Times New Roman" w:cs="Times New Roman"/>
@@ -29,21 +28,7 @@
           <w:lang w:eastAsia="it-IT"/>
           <w14:ligatures w14:val="none"/>
         </w:rPr>
-        <w:t>Storico modifiche</w:t>
-      </w:r>
-      <w:proofErr w:type="gramEnd"/>
-      <w:r>
-        <w:rPr>
-          <w:rFonts w:ascii="Times New Roman" w:eastAsia="Times New Roman" w:hAnsi="Times New Roman" w:cs="Times New Roman"/>
-          <w:b/>
-          <w:bCs/>
-          <w:kern w:val="0"/>
-          <w:sz w:val="32"/>
-          <w:szCs w:val="32"/>
-          <w:lang w:eastAsia="it-IT"/>
-          <w14:ligatures w14:val="none"/>
-        </w:rPr>
-        <w:t xml:space="preserve"> sito </w:t>
+        <w:t xml:space="preserve">Storico modifiche sito </w:t>
       </w:r>
       <w:proofErr w:type="spellStart"/>
       <w:r>
@@ -2454,31 +2439,7 @@
           <w14:ligatures w14:val="none"/>
         </w:rPr>
         <w:lastRenderedPageBreak/>
-        <w:t xml:space="preserve">Sono stati eliminati file HTML corrotti </w:t>
-      </w:r>
-      <w:proofErr w:type="gramStart"/>
-      <w:r>
-        <w:rPr>
-          <w:rFonts w:ascii="Times New Roman" w:eastAsia="Times New Roman" w:hAnsi="Times New Roman" w:cs="Times New Roman"/>
-          <w:kern w:val="0"/>
-          <w:sz w:val="22"/>
-          <w:szCs w:val="22"/>
-          <w:lang w:eastAsia="it-IT"/>
-          <w14:ligatures w14:val="none"/>
-        </w:rPr>
-        <w:t>nella root</w:t>
-      </w:r>
-      <w:proofErr w:type="gramEnd"/>
-      <w:r>
-        <w:rPr>
-          <w:rFonts w:ascii="Times New Roman" w:eastAsia="Times New Roman" w:hAnsi="Times New Roman" w:cs="Times New Roman"/>
-          <w:kern w:val="0"/>
-          <w:sz w:val="22"/>
-          <w:szCs w:val="22"/>
-          <w:lang w:eastAsia="it-IT"/>
-          <w14:ligatures w14:val="none"/>
-        </w:rPr>
-        <w:t xml:space="preserve"> del progetto, contenenti </w:t>
+        <w:t xml:space="preserve">Sono stati eliminati file HTML corrotti nella root del progetto, contenenti </w:t>
       </w:r>
       <w:proofErr w:type="spellStart"/>
       <w:r>
@@ -4412,7 +4373,6 @@
         <w:t xml:space="preserve">Mattina — Eliminazione </w:t>
       </w:r>
       <w:proofErr w:type="spellStart"/>
-      <w:proofErr w:type="gramStart"/>
       <w:r>
         <w:rPr>
           <w:rFonts w:ascii="Courier New" w:eastAsia="Times New Roman" w:hAnsi="Courier New" w:cs="Courier New"/>
@@ -4427,7 +4387,6 @@
         <w:t>netlify.toml</w:t>
       </w:r>
       <w:proofErr w:type="spellEnd"/>
-      <w:proofErr w:type="gramEnd"/>
     </w:p>
     <w:p>
       <w:pPr>
@@ -4484,7 +4443,6 @@
         </w:rPr>
       </w:pPr>
       <w:proofErr w:type="spellStart"/>
-      <w:proofErr w:type="gramStart"/>
       <w:r>
         <w:rPr>
           <w:rFonts w:ascii="Courier New" w:eastAsia="Times New Roman" w:hAnsi="Courier New" w:cs="Courier New"/>
@@ -4497,7 +4455,6 @@
         <w:t>netlify.toml</w:t>
       </w:r>
       <w:proofErr w:type="spellEnd"/>
-      <w:proofErr w:type="gramEnd"/>
     </w:p>
     <w:p>
       <w:pPr>
@@ -7218,19 +7175,7 @@
           <w:lang w:eastAsia="it-IT"/>
           <w14:ligatures w14:val="none"/>
         </w:rPr>
-        <w:t xml:space="preserve">usando esclusione della </w:t>
-      </w:r>
-      <w:proofErr w:type="gramStart"/>
-      <w:r>
-        <w:rPr>
-          <w:rFonts w:ascii="Times New Roman" w:eastAsia="Times New Roman" w:hAnsi="Times New Roman" w:cs="Times New Roman"/>
-          <w:kern w:val="0"/>
-          <w:sz w:val="22"/>
-          <w:szCs w:val="22"/>
-          <w:lang w:eastAsia="it-IT"/>
-          <w14:ligatures w14:val="none"/>
-        </w:rPr>
-        <w:t xml:space="preserve">cartella </w:t>
+        <w:t xml:space="preserve">usando esclusione della cartella </w:t>
       </w:r>
       <w:r>
         <w:rPr>
@@ -7256,7 +7201,6 @@
         <w:t>git</w:t>
       </w:r>
       <w:proofErr w:type="spellEnd"/>
-      <w:proofErr w:type="gramEnd"/>
       <w:r>
         <w:rPr>
           <w:rFonts w:ascii="Times New Roman" w:eastAsia="Times New Roman" w:hAnsi="Times New Roman" w:cs="Times New Roman"/>
@@ -8670,6 +8614,421 @@
           <w:szCs w:val="22"/>
         </w:rPr>
       </w:pPr>
+    </w:p>
+    <w:p>
+      <w:pPr>
+        <w:pStyle w:val="font-claude-response-body"/>
+      </w:pPr>
+      <w:r>
+        <w:rPr>
+          <w:rStyle w:val="Enfasigrassetto"/>
+          <w:rFonts w:eastAsiaTheme="majorEastAsia"/>
+        </w:rPr>
+        <w:t>Data:</w:t>
+      </w:r>
+      <w:r>
+        <w:t xml:space="preserve"> 08/08/2026</w:t>
+      </w:r>
+    </w:p>
+    <w:p>
+      <w:pPr>
+        <w:pStyle w:val="font-claude-response-body"/>
+      </w:pPr>
+      <w:r>
+        <w:rPr>
+          <w:rStyle w:val="Enfasigrassetto"/>
+          <w:rFonts w:eastAsiaTheme="majorEastAsia"/>
+        </w:rPr>
+        <w:t>Modifica:</w:t>
+      </w:r>
+      <w:r>
+        <w:t xml:space="preserve"> Aggiunta nuova FAQ "Età minima per il noleggio" (21 anni)</w:t>
+      </w:r>
+    </w:p>
+    <w:p>
+      <w:pPr>
+        <w:pStyle w:val="font-claude-response-body"/>
+      </w:pPr>
+      <w:r>
+        <w:rPr>
+          <w:rStyle w:val="Enfasigrassetto"/>
+          <w:rFonts w:eastAsiaTheme="majorEastAsia"/>
+        </w:rPr>
+        <w:t>Dettagli:</w:t>
+      </w:r>
+    </w:p>
+    <w:p>
+      <w:pPr>
+        <w:pStyle w:val="font-claude-response-body"/>
+        <w:numPr>
+          <w:ilvl w:val="0"/>
+          <w:numId w:val="27"/>
+        </w:numPr>
+      </w:pPr>
+      <w:r>
+        <w:t xml:space="preserve">Nuova FAQ inserita come </w:t>
+      </w:r>
+      <w:r>
+        <w:rPr>
+          <w:rStyle w:val="Enfasigrassetto"/>
+          <w:rFonts w:eastAsiaTheme="majorEastAsia"/>
+        </w:rPr>
+        <w:t>prima voce</w:t>
+      </w:r>
+      <w:r>
+        <w:t xml:space="preserve"> nelle pagine FAQ e nella sezione FAQ delle home page, in tutte le 5 lingue del sito (IT, EN, FR, ES, DE)</w:t>
+      </w:r>
+    </w:p>
+    <w:p>
+      <w:pPr>
+        <w:pStyle w:val="font-claude-response-body"/>
+        <w:numPr>
+          <w:ilvl w:val="0"/>
+          <w:numId w:val="27"/>
+        </w:numPr>
+      </w:pPr>
+      <w:r>
+        <w:t xml:space="preserve">File modificati (10 totali): </w:t>
+      </w:r>
+    </w:p>
+    <w:p>
+      <w:pPr>
+        <w:pStyle w:val="font-claude-response-body"/>
+        <w:numPr>
+          <w:ilvl w:val="1"/>
+          <w:numId w:val="27"/>
+        </w:numPr>
+      </w:pPr>
+      <w:proofErr w:type="spellStart"/>
+      <w:r>
+        <w:rPr>
+          <w:rStyle w:val="CodiceHTML"/>
+          <w:rFonts w:eastAsiaTheme="majorEastAsia"/>
+        </w:rPr>
+        <w:t>it</w:t>
+      </w:r>
+      <w:proofErr w:type="spellEnd"/>
+      <w:r>
+        <w:rPr>
+          <w:rStyle w:val="CodiceHTML"/>
+          <w:rFonts w:eastAsiaTheme="majorEastAsia"/>
+        </w:rPr>
+        <w:t>/index.html</w:t>
+      </w:r>
+      <w:r>
+        <w:t xml:space="preserve">, </w:t>
+      </w:r>
+      <w:proofErr w:type="spellStart"/>
+      <w:r>
+        <w:rPr>
+          <w:rStyle w:val="CodiceHTML"/>
+          <w:rFonts w:eastAsiaTheme="majorEastAsia"/>
+        </w:rPr>
+        <w:t>it</w:t>
+      </w:r>
+      <w:proofErr w:type="spellEnd"/>
+      <w:r>
+        <w:rPr>
+          <w:rStyle w:val="CodiceHTML"/>
+          <w:rFonts w:eastAsiaTheme="majorEastAsia"/>
+        </w:rPr>
+        <w:t>/faq.html</w:t>
+      </w:r>
+    </w:p>
+    <w:p>
+      <w:pPr>
+        <w:pStyle w:val="font-claude-response-body"/>
+        <w:numPr>
+          <w:ilvl w:val="1"/>
+          <w:numId w:val="27"/>
+        </w:numPr>
+      </w:pPr>
+      <w:r>
+        <w:rPr>
+          <w:rStyle w:val="CodiceHTML"/>
+          <w:rFonts w:eastAsiaTheme="majorEastAsia"/>
+        </w:rPr>
+        <w:t>en/index.html</w:t>
+      </w:r>
+      <w:r>
+        <w:t xml:space="preserve">, </w:t>
+      </w:r>
+      <w:r>
+        <w:rPr>
+          <w:rStyle w:val="CodiceHTML"/>
+          <w:rFonts w:eastAsiaTheme="majorEastAsia"/>
+        </w:rPr>
+        <w:t>en/faq.html</w:t>
+      </w:r>
+    </w:p>
+    <w:p>
+      <w:pPr>
+        <w:pStyle w:val="font-claude-response-body"/>
+        <w:numPr>
+          <w:ilvl w:val="1"/>
+          <w:numId w:val="27"/>
+        </w:numPr>
+      </w:pPr>
+      <w:r>
+        <w:rPr>
+          <w:rStyle w:val="CodiceHTML"/>
+          <w:rFonts w:eastAsiaTheme="majorEastAsia"/>
+        </w:rPr>
+        <w:t>fr/index.html</w:t>
+      </w:r>
+      <w:r>
+        <w:t xml:space="preserve">, </w:t>
+      </w:r>
+      <w:r>
+        <w:rPr>
+          <w:rStyle w:val="CodiceHTML"/>
+          <w:rFonts w:eastAsiaTheme="majorEastAsia"/>
+        </w:rPr>
+        <w:t>fr/faq.html</w:t>
+      </w:r>
+    </w:p>
+    <w:p>
+      <w:pPr>
+        <w:pStyle w:val="font-claude-response-body"/>
+        <w:numPr>
+          <w:ilvl w:val="1"/>
+          <w:numId w:val="27"/>
+        </w:numPr>
+      </w:pPr>
+      <w:r>
+        <w:rPr>
+          <w:rStyle w:val="CodiceHTML"/>
+          <w:rFonts w:eastAsiaTheme="majorEastAsia"/>
+        </w:rPr>
+        <w:t>es/index.html</w:t>
+      </w:r>
+      <w:r>
+        <w:t xml:space="preserve">, </w:t>
+      </w:r>
+      <w:r>
+        <w:rPr>
+          <w:rStyle w:val="CodiceHTML"/>
+          <w:rFonts w:eastAsiaTheme="majorEastAsia"/>
+        </w:rPr>
+        <w:t>es/faq.html</w:t>
+      </w:r>
+    </w:p>
+    <w:p>
+      <w:pPr>
+        <w:pStyle w:val="font-claude-response-body"/>
+        <w:numPr>
+          <w:ilvl w:val="1"/>
+          <w:numId w:val="27"/>
+        </w:numPr>
+      </w:pPr>
+      <w:r>
+        <w:rPr>
+          <w:rStyle w:val="CodiceHTML"/>
+          <w:rFonts w:eastAsiaTheme="majorEastAsia"/>
+        </w:rPr>
+        <w:t>de/index.html</w:t>
+      </w:r>
+      <w:r>
+        <w:t xml:space="preserve">, </w:t>
+      </w:r>
+      <w:r>
+        <w:rPr>
+          <w:rStyle w:val="CodiceHTML"/>
+          <w:rFonts w:eastAsiaTheme="majorEastAsia"/>
+        </w:rPr>
+        <w:t>de/faq.html</w:t>
+      </w:r>
+    </w:p>
+    <w:p>
+      <w:pPr>
+        <w:pStyle w:val="font-claude-response-body"/>
+        <w:numPr>
+          <w:ilvl w:val="0"/>
+          <w:numId w:val="27"/>
+        </w:numPr>
+      </w:pPr>
+      <w:r>
+        <w:t>Aggiornato anche il blocco dati strutturati JSON-LD (</w:t>
+      </w:r>
+      <w:proofErr w:type="spellStart"/>
+      <w:r>
+        <w:rPr>
+          <w:rStyle w:val="CodiceHTML"/>
+          <w:rFonts w:eastAsiaTheme="majorEastAsia"/>
+        </w:rPr>
+        <w:t>FAQPage</w:t>
+      </w:r>
+      <w:proofErr w:type="spellEnd"/>
+      <w:r>
+        <w:t>) in ciascun file, con testo corrispondente esattamente alla FAQ visibile</w:t>
+      </w:r>
+    </w:p>
+    <w:p>
+      <w:pPr>
+        <w:pStyle w:val="font-claude-response-body"/>
+        <w:numPr>
+          <w:ilvl w:val="0"/>
+          <w:numId w:val="27"/>
+        </w:numPr>
+      </w:pPr>
+      <w:r>
+        <w:t>Numero totale di FAQ per pagina: passato da 5 a 6</w:t>
+      </w:r>
+    </w:p>
+    <w:p>
+      <w:pPr>
+        <w:pStyle w:val="font-claude-response-body"/>
+      </w:pPr>
+      <w:r>
+        <w:rPr>
+          <w:rStyle w:val="Enfasigrassetto"/>
+          <w:rFonts w:eastAsiaTheme="majorEastAsia"/>
+        </w:rPr>
+        <w:t>Contenuto FAQ aggiunta (IT):</w:t>
+      </w:r>
+    </w:p>
+    <w:p>
+      <w:pPr>
+        <w:pStyle w:val="font-claude-response-body"/>
+      </w:pPr>
+      <w:r>
+        <w:rPr>
+          <w:rStyle w:val="Enfasigrassetto"/>
+          <w:rFonts w:eastAsiaTheme="majorEastAsia"/>
+        </w:rPr>
+        <w:t>D:</w:t>
+      </w:r>
+      <w:r>
+        <w:t xml:space="preserve"> Qual è l'età minima richiesta per noleggiare una Vespa o uno scooter?</w:t>
+      </w:r>
+      <w:r>
+        <w:br/>
+      </w:r>
+      <w:r>
+        <w:rPr>
+          <w:rStyle w:val="Enfasigrassetto"/>
+          <w:rFonts w:eastAsiaTheme="majorEastAsia"/>
+        </w:rPr>
+        <w:t>R:</w:t>
+      </w:r>
+      <w:r>
+        <w:t xml:space="preserve"> Per noleggiare e guidare le nostre Vespe o scooter è necessario avere almeno 21 anni. Questa condizione ci permette di offrirti un'esperienza di guida il più possibile sicura e piacevole.</w:t>
+      </w:r>
+    </w:p>
+    <w:p>
+      <w:pPr>
+        <w:pStyle w:val="font-claude-response-body"/>
+      </w:pPr>
+      <w:r>
+        <w:rPr>
+          <w:rStyle w:val="Enfasigrassetto"/>
+          <w:rFonts w:eastAsiaTheme="majorEastAsia"/>
+        </w:rPr>
+        <w:t>Processo:</w:t>
+      </w:r>
+    </w:p>
+    <w:p>
+      <w:pPr>
+        <w:pStyle w:val="font-claude-response-body"/>
+        <w:numPr>
+          <w:ilvl w:val="0"/>
+          <w:numId w:val="28"/>
+        </w:numPr>
+      </w:pPr>
+      <w:r>
+        <w:t>Modifica effettuata da Devin su istruzioni dettagliate con vincoli rigidi (nessun'altra modifica a testi, CSS, JS, layout, JSON-LD esistente)</w:t>
+      </w:r>
+    </w:p>
+    <w:p>
+      <w:pPr>
+        <w:pStyle w:val="font-claude-response-body"/>
+        <w:numPr>
+          <w:ilvl w:val="0"/>
+          <w:numId w:val="28"/>
+        </w:numPr>
+      </w:pPr>
+      <w:r>
+        <w:t xml:space="preserve">Rilevato e corretto un piccolo errore di formattazione (riga vuota indesiderata nel JSON-LD di </w:t>
+      </w:r>
+      <w:r>
+        <w:rPr>
+          <w:rStyle w:val="CodiceHTML"/>
+          <w:rFonts w:eastAsiaTheme="majorEastAsia"/>
+        </w:rPr>
+        <w:t>de/faq.html</w:t>
+      </w:r>
+      <w:r>
+        <w:t>), verificato che non fosse presente negli altri 9 file</w:t>
+      </w:r>
+    </w:p>
+    <w:p>
+      <w:pPr>
+        <w:pStyle w:val="font-claude-response-body"/>
+        <w:numPr>
+          <w:ilvl w:val="0"/>
+          <w:numId w:val="28"/>
+        </w:numPr>
+      </w:pPr>
+      <w:r>
+        <w:t xml:space="preserve">Verifica finale in locale (server Python) prima del </w:t>
+      </w:r>
+      <w:proofErr w:type="spellStart"/>
+      <w:r>
+        <w:t>deploy</w:t>
+      </w:r>
+      <w:proofErr w:type="spellEnd"/>
+    </w:p>
+    <w:p>
+      <w:pPr>
+        <w:pStyle w:val="font-claude-response-body"/>
+        <w:numPr>
+          <w:ilvl w:val="0"/>
+          <w:numId w:val="28"/>
+        </w:numPr>
+      </w:pPr>
+      <w:proofErr w:type="spellStart"/>
+      <w:r>
+        <w:t>Commit</w:t>
+      </w:r>
+      <w:proofErr w:type="spellEnd"/>
+      <w:r>
+        <w:t xml:space="preserve">: </w:t>
+      </w:r>
+      <w:r>
+        <w:rPr>
+          <w:rStyle w:val="CodiceHTML"/>
+          <w:rFonts w:eastAsiaTheme="majorEastAsia"/>
+        </w:rPr>
+        <w:t>b5daf7f</w:t>
+      </w:r>
+      <w:r>
+        <w:t xml:space="preserve"> — "Aggiunta nuova FAQ </w:t>
+      </w:r>
+      <w:proofErr w:type="spellStart"/>
+      <w:r>
+        <w:t>eta</w:t>
+      </w:r>
+      <w:proofErr w:type="spellEnd"/>
+      <w:r>
+        <w:t xml:space="preserve"> minima 21 anni in tutte le lingue"</w:t>
+      </w:r>
+    </w:p>
+    <w:p>
+      <w:pPr>
+        <w:pStyle w:val="font-claude-response-body"/>
+        <w:numPr>
+          <w:ilvl w:val="0"/>
+          <w:numId w:val="28"/>
+        </w:numPr>
+      </w:pPr>
+      <w:proofErr w:type="spellStart"/>
+      <w:r>
+        <w:t>Push</w:t>
+      </w:r>
+      <w:proofErr w:type="spellEnd"/>
+      <w:r>
+        <w:t xml:space="preserve"> completato su GitHub, sito aggiornato via GitHub Pages</w:t>
+      </w:r>
     </w:p>
     <w:p>
       <w:pPr>
@@ -8998,6 +9357,155 @@
     </w:lvl>
   </w:abstractNum>
   <w:abstractNum w:abstractNumId="2" w15:restartNumberingAfterBreak="0">
+    <w:nsid w:val="167E0257"/>
+    <w:multiLevelType w:val="multilevel"/>
+    <w:tmpl w:val="D4B23528"/>
+    <w:lvl w:ilvl="0">
+      <w:start w:val="1"/>
+      <w:numFmt w:val="bullet"/>
+      <w:lvlText w:val=""/>
+      <w:lvlJc w:val="left"/>
+      <w:pPr>
+        <w:tabs>
+          <w:tab w:val="num" w:pos="720"/>
+        </w:tabs>
+        <w:ind w:left="720" w:hanging="360"/>
+      </w:pPr>
+      <w:rPr>
+        <w:rFonts w:ascii="Symbol" w:hAnsi="Symbol" w:hint="default"/>
+        <w:sz w:val="20"/>
+      </w:rPr>
+    </w:lvl>
+    <w:lvl w:ilvl="1" w:tentative="1">
+      <w:start w:val="1"/>
+      <w:numFmt w:val="bullet"/>
+      <w:lvlText w:val="o"/>
+      <w:lvlJc w:val="left"/>
+      <w:pPr>
+        <w:tabs>
+          <w:tab w:val="num" w:pos="1440"/>
+        </w:tabs>
+        <w:ind w:left="1440" w:hanging="360"/>
+      </w:pPr>
+      <w:rPr>
+        <w:rFonts w:ascii="Courier New" w:hAnsi="Courier New" w:hint="default"/>
+        <w:sz w:val="20"/>
+      </w:rPr>
+    </w:lvl>
+    <w:lvl w:ilvl="2" w:tentative="1">
+      <w:start w:val="1"/>
+      <w:numFmt w:val="bullet"/>
+      <w:lvlText w:val=""/>
+      <w:lvlJc w:val="left"/>
+      <w:pPr>
+        <w:tabs>
+          <w:tab w:val="num" w:pos="2160"/>
+        </w:tabs>
+        <w:ind w:left="2160" w:hanging="360"/>
+      </w:pPr>
+      <w:rPr>
+        <w:rFonts w:ascii="Wingdings" w:hAnsi="Wingdings" w:hint="default"/>
+        <w:sz w:val="20"/>
+      </w:rPr>
+    </w:lvl>
+    <w:lvl w:ilvl="3" w:tentative="1">
+      <w:start w:val="1"/>
+      <w:numFmt w:val="bullet"/>
+      <w:lvlText w:val=""/>
+      <w:lvlJc w:val="left"/>
+      <w:pPr>
+        <w:tabs>
+          <w:tab w:val="num" w:pos="2880"/>
+        </w:tabs>
+        <w:ind w:left="2880" w:hanging="360"/>
+      </w:pPr>
+      <w:rPr>
+        <w:rFonts w:ascii="Wingdings" w:hAnsi="Wingdings" w:hint="default"/>
+        <w:sz w:val="20"/>
+      </w:rPr>
+    </w:lvl>
+    <w:lvl w:ilvl="4" w:tentative="1">
+      <w:start w:val="1"/>
+      <w:numFmt w:val="bullet"/>
+      <w:lvlText w:val=""/>
+      <w:lvlJc w:val="left"/>
+      <w:pPr>
+        <w:tabs>
+          <w:tab w:val="num" w:pos="3600"/>
+        </w:tabs>
+        <w:ind w:left="3600" w:hanging="360"/>
+      </w:pPr>
+      <w:rPr>
+        <w:rFonts w:ascii="Wingdings" w:hAnsi="Wingdings" w:hint="default"/>
+        <w:sz w:val="20"/>
+      </w:rPr>
+    </w:lvl>
+    <w:lvl w:ilvl="5" w:tentative="1">
+      <w:start w:val="1"/>
+      <w:numFmt w:val="bullet"/>
+      <w:lvlText w:val=""/>
+      <w:lvlJc w:val="left"/>
+      <w:pPr>
+        <w:tabs>
+          <w:tab w:val="num" w:pos="4320"/>
+        </w:tabs>
+        <w:ind w:left="4320" w:hanging="360"/>
+      </w:pPr>
+      <w:rPr>
+        <w:rFonts w:ascii="Wingdings" w:hAnsi="Wingdings" w:hint="default"/>
+        <w:sz w:val="20"/>
+      </w:rPr>
+    </w:lvl>
+    <w:lvl w:ilvl="6" w:tentative="1">
+      <w:start w:val="1"/>
+      <w:numFmt w:val="bullet"/>
+      <w:lvlText w:val=""/>
+      <w:lvlJc w:val="left"/>
+      <w:pPr>
+        <w:tabs>
+          <w:tab w:val="num" w:pos="5040"/>
+        </w:tabs>
+        <w:ind w:left="5040" w:hanging="360"/>
+      </w:pPr>
+      <w:rPr>
+        <w:rFonts w:ascii="Wingdings" w:hAnsi="Wingdings" w:hint="default"/>
+        <w:sz w:val="20"/>
+      </w:rPr>
+    </w:lvl>
+    <w:lvl w:ilvl="7" w:tentative="1">
+      <w:start w:val="1"/>
+      <w:numFmt w:val="bullet"/>
+      <w:lvlText w:val=""/>
+      <w:lvlJc w:val="left"/>
+      <w:pPr>
+        <w:tabs>
+          <w:tab w:val="num" w:pos="5760"/>
+        </w:tabs>
+        <w:ind w:left="5760" w:hanging="360"/>
+      </w:pPr>
+      <w:rPr>
+        <w:rFonts w:ascii="Wingdings" w:hAnsi="Wingdings" w:hint="default"/>
+        <w:sz w:val="20"/>
+      </w:rPr>
+    </w:lvl>
+    <w:lvl w:ilvl="8" w:tentative="1">
+      <w:start w:val="1"/>
+      <w:numFmt w:val="bullet"/>
+      <w:lvlText w:val=""/>
+      <w:lvlJc w:val="left"/>
+      <w:pPr>
+        <w:tabs>
+          <w:tab w:val="num" w:pos="6480"/>
+        </w:tabs>
+        <w:ind w:left="6480" w:hanging="360"/>
+      </w:pPr>
+      <w:rPr>
+        <w:rFonts w:ascii="Wingdings" w:hAnsi="Wingdings" w:hint="default"/>
+        <w:sz w:val="20"/>
+      </w:rPr>
+    </w:lvl>
+  </w:abstractNum>
+  <w:abstractNum w:abstractNumId="3" w15:restartNumberingAfterBreak="0">
     <w:nsid w:val="1CEF411E"/>
     <w:multiLevelType w:val="multilevel"/>
     <w:tmpl w:val="AC3C0846"/>
@@ -9146,7 +9654,7 @@
       </w:rPr>
     </w:lvl>
   </w:abstractNum>
-  <w:abstractNum w:abstractNumId="3" w15:restartNumberingAfterBreak="0">
+  <w:abstractNum w:abstractNumId="4" w15:restartNumberingAfterBreak="0">
     <w:nsid w:val="1DC018AB"/>
     <w:multiLevelType w:val="multilevel"/>
     <w:tmpl w:val="360E1986"/>
@@ -9295,7 +9803,7 @@
       </w:rPr>
     </w:lvl>
   </w:abstractNum>
-  <w:abstractNum w:abstractNumId="4" w15:restartNumberingAfterBreak="0">
+  <w:abstractNum w:abstractNumId="5" w15:restartNumberingAfterBreak="0">
     <w:nsid w:val="20644FFC"/>
     <w:multiLevelType w:val="multilevel"/>
     <w:tmpl w:val="9482B9EE"/>
@@ -9444,7 +9952,7 @@
       </w:rPr>
     </w:lvl>
   </w:abstractNum>
-  <w:abstractNum w:abstractNumId="5" w15:restartNumberingAfterBreak="0">
+  <w:abstractNum w:abstractNumId="6" w15:restartNumberingAfterBreak="0">
     <w:nsid w:val="22BD63F2"/>
     <w:multiLevelType w:val="multilevel"/>
     <w:tmpl w:val="241A4F68"/>
@@ -9593,7 +10101,7 @@
       </w:rPr>
     </w:lvl>
   </w:abstractNum>
-  <w:abstractNum w:abstractNumId="6" w15:restartNumberingAfterBreak="0">
+  <w:abstractNum w:abstractNumId="7" w15:restartNumberingAfterBreak="0">
     <w:nsid w:val="23372D14"/>
     <w:multiLevelType w:val="multilevel"/>
     <w:tmpl w:val="3A16DF9A"/>
@@ -9742,7 +10250,7 @@
       </w:rPr>
     </w:lvl>
   </w:abstractNum>
-  <w:abstractNum w:abstractNumId="7" w15:restartNumberingAfterBreak="0">
+  <w:abstractNum w:abstractNumId="8" w15:restartNumberingAfterBreak="0">
     <w:nsid w:val="26E67D59"/>
     <w:multiLevelType w:val="multilevel"/>
     <w:tmpl w:val="428A086E"/>
@@ -9891,7 +10399,7 @@
       </w:rPr>
     </w:lvl>
   </w:abstractNum>
-  <w:abstractNum w:abstractNumId="8" w15:restartNumberingAfterBreak="0">
+  <w:abstractNum w:abstractNumId="9" w15:restartNumberingAfterBreak="0">
     <w:nsid w:val="285A31AE"/>
     <w:multiLevelType w:val="multilevel"/>
     <w:tmpl w:val="17C41C12"/>
@@ -10040,7 +10548,156 @@
       </w:rPr>
     </w:lvl>
   </w:abstractNum>
-  <w:abstractNum w:abstractNumId="9" w15:restartNumberingAfterBreak="0">
+  <w:abstractNum w:abstractNumId="10" w15:restartNumberingAfterBreak="0">
+    <w:nsid w:val="28DF2E7C"/>
+    <w:multiLevelType w:val="multilevel"/>
+    <w:tmpl w:val="320C7DD0"/>
+    <w:lvl w:ilvl="0">
+      <w:start w:val="1"/>
+      <w:numFmt w:val="bullet"/>
+      <w:lvlText w:val=""/>
+      <w:lvlJc w:val="left"/>
+      <w:pPr>
+        <w:tabs>
+          <w:tab w:val="num" w:pos="720"/>
+        </w:tabs>
+        <w:ind w:left="720" w:hanging="360"/>
+      </w:pPr>
+      <w:rPr>
+        <w:rFonts w:ascii="Symbol" w:hAnsi="Symbol" w:hint="default"/>
+        <w:sz w:val="20"/>
+      </w:rPr>
+    </w:lvl>
+    <w:lvl w:ilvl="1">
+      <w:start w:val="1"/>
+      <w:numFmt w:val="bullet"/>
+      <w:lvlText w:val="o"/>
+      <w:lvlJc w:val="left"/>
+      <w:pPr>
+        <w:tabs>
+          <w:tab w:val="num" w:pos="1440"/>
+        </w:tabs>
+        <w:ind w:left="1440" w:hanging="360"/>
+      </w:pPr>
+      <w:rPr>
+        <w:rFonts w:ascii="Courier New" w:hAnsi="Courier New" w:hint="default"/>
+        <w:sz w:val="20"/>
+      </w:rPr>
+    </w:lvl>
+    <w:lvl w:ilvl="2" w:tentative="1">
+      <w:start w:val="1"/>
+      <w:numFmt w:val="bullet"/>
+      <w:lvlText w:val=""/>
+      <w:lvlJc w:val="left"/>
+      <w:pPr>
+        <w:tabs>
+          <w:tab w:val="num" w:pos="2160"/>
+        </w:tabs>
+        <w:ind w:left="2160" w:hanging="360"/>
+      </w:pPr>
+      <w:rPr>
+        <w:rFonts w:ascii="Wingdings" w:hAnsi="Wingdings" w:hint="default"/>
+        <w:sz w:val="20"/>
+      </w:rPr>
+    </w:lvl>
+    <w:lvl w:ilvl="3" w:tentative="1">
+      <w:start w:val="1"/>
+      <w:numFmt w:val="bullet"/>
+      <w:lvlText w:val=""/>
+      <w:lvlJc w:val="left"/>
+      <w:pPr>
+        <w:tabs>
+          <w:tab w:val="num" w:pos="2880"/>
+        </w:tabs>
+        <w:ind w:left="2880" w:hanging="360"/>
+      </w:pPr>
+      <w:rPr>
+        <w:rFonts w:ascii="Wingdings" w:hAnsi="Wingdings" w:hint="default"/>
+        <w:sz w:val="20"/>
+      </w:rPr>
+    </w:lvl>
+    <w:lvl w:ilvl="4" w:tentative="1">
+      <w:start w:val="1"/>
+      <w:numFmt w:val="bullet"/>
+      <w:lvlText w:val=""/>
+      <w:lvlJc w:val="left"/>
+      <w:pPr>
+        <w:tabs>
+          <w:tab w:val="num" w:pos="3600"/>
+        </w:tabs>
+        <w:ind w:left="3600" w:hanging="360"/>
+      </w:pPr>
+      <w:rPr>
+        <w:rFonts w:ascii="Wingdings" w:hAnsi="Wingdings" w:hint="default"/>
+        <w:sz w:val="20"/>
+      </w:rPr>
+    </w:lvl>
+    <w:lvl w:ilvl="5" w:tentative="1">
+      <w:start w:val="1"/>
+      <w:numFmt w:val="bullet"/>
+      <w:lvlText w:val=""/>
+      <w:lvlJc w:val="left"/>
+      <w:pPr>
+        <w:tabs>
+          <w:tab w:val="num" w:pos="4320"/>
+        </w:tabs>
+        <w:ind w:left="4320" w:hanging="360"/>
+      </w:pPr>
+      <w:rPr>
+        <w:rFonts w:ascii="Wingdings" w:hAnsi="Wingdings" w:hint="default"/>
+        <w:sz w:val="20"/>
+      </w:rPr>
+    </w:lvl>
+    <w:lvl w:ilvl="6" w:tentative="1">
+      <w:start w:val="1"/>
+      <w:numFmt w:val="bullet"/>
+      <w:lvlText w:val=""/>
+      <w:lvlJc w:val="left"/>
+      <w:pPr>
+        <w:tabs>
+          <w:tab w:val="num" w:pos="5040"/>
+        </w:tabs>
+        <w:ind w:left="5040" w:hanging="360"/>
+      </w:pPr>
+      <w:rPr>
+        <w:rFonts w:ascii="Wingdings" w:hAnsi="Wingdings" w:hint="default"/>
+        <w:sz w:val="20"/>
+      </w:rPr>
+    </w:lvl>
+    <w:lvl w:ilvl="7" w:tentative="1">
+      <w:start w:val="1"/>
+      <w:numFmt w:val="bullet"/>
+      <w:lvlText w:val=""/>
+      <w:lvlJc w:val="left"/>
+      <w:pPr>
+        <w:tabs>
+          <w:tab w:val="num" w:pos="5760"/>
+        </w:tabs>
+        <w:ind w:left="5760" w:hanging="360"/>
+      </w:pPr>
+      <w:rPr>
+        <w:rFonts w:ascii="Wingdings" w:hAnsi="Wingdings" w:hint="default"/>
+        <w:sz w:val="20"/>
+      </w:rPr>
+    </w:lvl>
+    <w:lvl w:ilvl="8" w:tentative="1">
+      <w:start w:val="1"/>
+      <w:numFmt w:val="bullet"/>
+      <w:lvlText w:val=""/>
+      <w:lvlJc w:val="left"/>
+      <w:pPr>
+        <w:tabs>
+          <w:tab w:val="num" w:pos="6480"/>
+        </w:tabs>
+        <w:ind w:left="6480" w:hanging="360"/>
+      </w:pPr>
+      <w:rPr>
+        <w:rFonts w:ascii="Wingdings" w:hAnsi="Wingdings" w:hint="default"/>
+        <w:sz w:val="20"/>
+      </w:rPr>
+    </w:lvl>
+  </w:abstractNum>
+  <w:abstractNum w:abstractNumId="11" w15:restartNumberingAfterBreak="0">
     <w:nsid w:val="30A14CA8"/>
     <w:multiLevelType w:val="multilevel"/>
     <w:tmpl w:val="12A6C2D8"/>
@@ -10189,7 +10846,7 @@
       </w:rPr>
     </w:lvl>
   </w:abstractNum>
-  <w:abstractNum w:abstractNumId="10" w15:restartNumberingAfterBreak="0">
+  <w:abstractNum w:abstractNumId="12" w15:restartNumberingAfterBreak="0">
     <w:nsid w:val="4B890BEE"/>
     <w:multiLevelType w:val="multilevel"/>
     <w:tmpl w:val="A6465F88"/>
@@ -10338,7 +10995,7 @@
       </w:rPr>
     </w:lvl>
   </w:abstractNum>
-  <w:abstractNum w:abstractNumId="11" w15:restartNumberingAfterBreak="0">
+  <w:abstractNum w:abstractNumId="13" w15:restartNumberingAfterBreak="0">
     <w:nsid w:val="4D487C34"/>
     <w:multiLevelType w:val="multilevel"/>
     <w:tmpl w:val="41FCD628"/>
@@ -10487,7 +11144,7 @@
       </w:rPr>
     </w:lvl>
   </w:abstractNum>
-  <w:abstractNum w:abstractNumId="12" w15:restartNumberingAfterBreak="0">
+  <w:abstractNum w:abstractNumId="14" w15:restartNumberingAfterBreak="0">
     <w:nsid w:val="50B903CE"/>
     <w:multiLevelType w:val="multilevel"/>
     <w:tmpl w:val="4E044EA4"/>
@@ -10636,7 +11293,7 @@
       </w:rPr>
     </w:lvl>
   </w:abstractNum>
-  <w:abstractNum w:abstractNumId="13" w15:restartNumberingAfterBreak="0">
+  <w:abstractNum w:abstractNumId="15" w15:restartNumberingAfterBreak="0">
     <w:nsid w:val="5253758B"/>
     <w:multiLevelType w:val="multilevel"/>
     <w:tmpl w:val="3D0ED0B4"/>
@@ -10785,7 +11442,7 @@
       </w:rPr>
     </w:lvl>
   </w:abstractNum>
-  <w:abstractNum w:abstractNumId="14" w15:restartNumberingAfterBreak="0">
+  <w:abstractNum w:abstractNumId="16" w15:restartNumberingAfterBreak="0">
     <w:nsid w:val="552121FE"/>
     <w:multiLevelType w:val="multilevel"/>
     <w:tmpl w:val="9AEE1BC2"/>
@@ -10934,7 +11591,7 @@
       </w:rPr>
     </w:lvl>
   </w:abstractNum>
-  <w:abstractNum w:abstractNumId="15" w15:restartNumberingAfterBreak="0">
+  <w:abstractNum w:abstractNumId="17" w15:restartNumberingAfterBreak="0">
     <w:nsid w:val="5535283A"/>
     <w:multiLevelType w:val="multilevel"/>
     <w:tmpl w:val="0400BE12"/>
@@ -11083,7 +11740,7 @@
       </w:rPr>
     </w:lvl>
   </w:abstractNum>
-  <w:abstractNum w:abstractNumId="16" w15:restartNumberingAfterBreak="0">
+  <w:abstractNum w:abstractNumId="18" w15:restartNumberingAfterBreak="0">
     <w:nsid w:val="5F520AB0"/>
     <w:multiLevelType w:val="multilevel"/>
     <w:tmpl w:val="8452DA64"/>
@@ -11232,7 +11889,7 @@
       </w:rPr>
     </w:lvl>
   </w:abstractNum>
-  <w:abstractNum w:abstractNumId="17" w15:restartNumberingAfterBreak="0">
+  <w:abstractNum w:abstractNumId="19" w15:restartNumberingAfterBreak="0">
     <w:nsid w:val="612D59DA"/>
     <w:multiLevelType w:val="multilevel"/>
     <w:tmpl w:val="8E56E12C"/>
@@ -11381,7 +12038,7 @@
       </w:rPr>
     </w:lvl>
   </w:abstractNum>
-  <w:abstractNum w:abstractNumId="18" w15:restartNumberingAfterBreak="0">
+  <w:abstractNum w:abstractNumId="20" w15:restartNumberingAfterBreak="0">
     <w:nsid w:val="628C613D"/>
     <w:multiLevelType w:val="multilevel"/>
     <w:tmpl w:val="6DACEA74"/>
@@ -11530,7 +12187,7 @@
       </w:rPr>
     </w:lvl>
   </w:abstractNum>
-  <w:abstractNum w:abstractNumId="19" w15:restartNumberingAfterBreak="0">
+  <w:abstractNum w:abstractNumId="21" w15:restartNumberingAfterBreak="0">
     <w:nsid w:val="68303F90"/>
     <w:multiLevelType w:val="multilevel"/>
     <w:tmpl w:val="6DDAD3DA"/>
@@ -11679,7 +12336,7 @@
       </w:rPr>
     </w:lvl>
   </w:abstractNum>
-  <w:abstractNum w:abstractNumId="20" w15:restartNumberingAfterBreak="0">
+  <w:abstractNum w:abstractNumId="22" w15:restartNumberingAfterBreak="0">
     <w:nsid w:val="6C490C0F"/>
     <w:multiLevelType w:val="multilevel"/>
     <w:tmpl w:val="7C36BB20"/>
@@ -11828,7 +12485,7 @@
       </w:rPr>
     </w:lvl>
   </w:abstractNum>
-  <w:abstractNum w:abstractNumId="21" w15:restartNumberingAfterBreak="0">
+  <w:abstractNum w:abstractNumId="23" w15:restartNumberingAfterBreak="0">
     <w:nsid w:val="6D4E26CF"/>
     <w:multiLevelType w:val="multilevel"/>
     <w:tmpl w:val="0D98EAD0"/>
@@ -11977,7 +12634,7 @@
       </w:rPr>
     </w:lvl>
   </w:abstractNum>
-  <w:abstractNum w:abstractNumId="22" w15:restartNumberingAfterBreak="0">
+  <w:abstractNum w:abstractNumId="24" w15:restartNumberingAfterBreak="0">
     <w:nsid w:val="6EFB6FE3"/>
     <w:multiLevelType w:val="multilevel"/>
     <w:tmpl w:val="57D640FE"/>
@@ -12126,7 +12783,7 @@
       </w:rPr>
     </w:lvl>
   </w:abstractNum>
-  <w:abstractNum w:abstractNumId="23" w15:restartNumberingAfterBreak="0">
+  <w:abstractNum w:abstractNumId="25" w15:restartNumberingAfterBreak="0">
     <w:nsid w:val="7A793EC9"/>
     <w:multiLevelType w:val="multilevel"/>
     <w:tmpl w:val="DB141E06"/>
@@ -12275,7 +12932,7 @@
       </w:rPr>
     </w:lvl>
   </w:abstractNum>
-  <w:abstractNum w:abstractNumId="24" w15:restartNumberingAfterBreak="0">
+  <w:abstractNum w:abstractNumId="26" w15:restartNumberingAfterBreak="0">
     <w:nsid w:val="7ACF3AB2"/>
     <w:multiLevelType w:val="multilevel"/>
     <w:tmpl w:val="207ED2C4"/>
@@ -12424,7 +13081,7 @@
       </w:rPr>
     </w:lvl>
   </w:abstractNum>
-  <w:abstractNum w:abstractNumId="25" w15:restartNumberingAfterBreak="0">
+  <w:abstractNum w:abstractNumId="27" w15:restartNumberingAfterBreak="0">
     <w:nsid w:val="7C191F99"/>
     <w:multiLevelType w:val="multilevel"/>
     <w:tmpl w:val="B63A4282"/>
@@ -12574,82 +13231,88 @@
     </w:lvl>
   </w:abstractNum>
   <w:num w:numId="1" w16cid:durableId="1445148184">
+    <w:abstractNumId w:val="24"/>
+  </w:num>
+  <w:num w:numId="2" w16cid:durableId="442188035">
+    <w:abstractNumId w:val="26"/>
+  </w:num>
+  <w:num w:numId="3" w16cid:durableId="218906370">
+    <w:abstractNumId w:val="15"/>
+  </w:num>
+  <w:num w:numId="4" w16cid:durableId="508494845">
+    <w:abstractNumId w:val="25"/>
+  </w:num>
+  <w:num w:numId="5" w16cid:durableId="974680489">
+    <w:abstractNumId w:val="5"/>
+  </w:num>
+  <w:num w:numId="6" w16cid:durableId="1712068459">
+    <w:abstractNumId w:val="8"/>
+  </w:num>
+  <w:num w:numId="7" w16cid:durableId="1875924512">
+    <w:abstractNumId w:val="6"/>
+  </w:num>
+  <w:num w:numId="8" w16cid:durableId="561403928">
+    <w:abstractNumId w:val="17"/>
+  </w:num>
+  <w:num w:numId="9" w16cid:durableId="1014377">
+    <w:abstractNumId w:val="19"/>
+  </w:num>
+  <w:num w:numId="10" w16cid:durableId="62291620">
+    <w:abstractNumId w:val="21"/>
+  </w:num>
+  <w:num w:numId="11" w16cid:durableId="1647777988">
+    <w:abstractNumId w:val="3"/>
+  </w:num>
+  <w:num w:numId="12" w16cid:durableId="818183555">
+    <w:abstractNumId w:val="13"/>
+  </w:num>
+  <w:num w:numId="13" w16cid:durableId="1979801839">
+    <w:abstractNumId w:val="23"/>
+  </w:num>
+  <w:num w:numId="14" w16cid:durableId="456684343">
     <w:abstractNumId w:val="22"/>
   </w:num>
-  <w:num w:numId="2" w16cid:durableId="442188035">
-    <w:abstractNumId w:val="24"/>
-  </w:num>
-  <w:num w:numId="3" w16cid:durableId="218906370">
-    <w:abstractNumId w:val="13"/>
-  </w:num>
-  <w:num w:numId="4" w16cid:durableId="508494845">
-    <w:abstractNumId w:val="23"/>
-  </w:num>
-  <w:num w:numId="5" w16cid:durableId="974680489">
-    <w:abstractNumId w:val="4"/>
-  </w:num>
-  <w:num w:numId="6" w16cid:durableId="1712068459">
-    <w:abstractNumId w:val="7"/>
-  </w:num>
-  <w:num w:numId="7" w16cid:durableId="1875924512">
-    <w:abstractNumId w:val="5"/>
-  </w:num>
-  <w:num w:numId="8" w16cid:durableId="561403928">
-    <w:abstractNumId w:val="15"/>
-  </w:num>
-  <w:num w:numId="9" w16cid:durableId="1014377">
-    <w:abstractNumId w:val="17"/>
-  </w:num>
-  <w:num w:numId="10" w16cid:durableId="62291620">
-    <w:abstractNumId w:val="19"/>
-  </w:num>
-  <w:num w:numId="11" w16cid:durableId="1647777988">
-    <w:abstractNumId w:val="2"/>
-  </w:num>
-  <w:num w:numId="12" w16cid:durableId="818183555">
-    <w:abstractNumId w:val="11"/>
-  </w:num>
-  <w:num w:numId="13" w16cid:durableId="1979801839">
-    <w:abstractNumId w:val="21"/>
-  </w:num>
-  <w:num w:numId="14" w16cid:durableId="456684343">
-    <w:abstractNumId w:val="20"/>
-  </w:num>
   <w:num w:numId="15" w16cid:durableId="1718041894">
-    <w:abstractNumId w:val="16"/>
+    <w:abstractNumId w:val="18"/>
   </w:num>
   <w:num w:numId="16" w16cid:durableId="906577070">
-    <w:abstractNumId w:val="3"/>
+    <w:abstractNumId w:val="4"/>
   </w:num>
   <w:num w:numId="17" w16cid:durableId="578713329">
     <w:abstractNumId w:val="0"/>
   </w:num>
   <w:num w:numId="18" w16cid:durableId="542060949">
-    <w:abstractNumId w:val="10"/>
+    <w:abstractNumId w:val="12"/>
   </w:num>
   <w:num w:numId="19" w16cid:durableId="569651936">
-    <w:abstractNumId w:val="14"/>
+    <w:abstractNumId w:val="16"/>
   </w:num>
   <w:num w:numId="20" w16cid:durableId="1832090292">
-    <w:abstractNumId w:val="25"/>
+    <w:abstractNumId w:val="27"/>
   </w:num>
   <w:num w:numId="21" w16cid:durableId="280308849">
     <w:abstractNumId w:val="1"/>
   </w:num>
   <w:num w:numId="22" w16cid:durableId="1423185241">
-    <w:abstractNumId w:val="6"/>
+    <w:abstractNumId w:val="7"/>
   </w:num>
   <w:num w:numId="23" w16cid:durableId="747962396">
-    <w:abstractNumId w:val="8"/>
+    <w:abstractNumId w:val="9"/>
   </w:num>
   <w:num w:numId="24" w16cid:durableId="910652616">
-    <w:abstractNumId w:val="12"/>
+    <w:abstractNumId w:val="14"/>
   </w:num>
   <w:num w:numId="25" w16cid:durableId="170292183">
-    <w:abstractNumId w:val="18"/>
+    <w:abstractNumId w:val="20"/>
   </w:num>
   <w:num w:numId="26" w16cid:durableId="974070236">
-    <w:abstractNumId w:val="9"/>
+    <w:abstractNumId w:val="11"/>
+  </w:num>
+  <w:num w:numId="27" w16cid:durableId="264919475">
+    <w:abstractNumId w:val="10"/>
+  </w:num>
+  <w:num w:numId="28" w16cid:durableId="1192958133">
+    <w:abstractNumId w:val="2"/>
   </w:num>
 </w:numbering>
 </file>

</xml_diff>